<commit_message>
Revise the manuscript after internal review; add Note 9-22 results
Note 9-22 analyses (frozen in 142934a): documentation differences among empirical papers, release fields with
unclear counted as none, and the verdict mix by group, identical under two hash seeds, with a test against the
release table. The manuscript now uses one group name, reports the empirical-only and unclear-as-none results
(Table 4), separates the decided and full-verification gaps by sample, adds the within-paper team-strength test,
cites the earlier Protocol 7 code-link result, corrects the coder description, splits Figure 3 into paper and claim
levels, and cites REFORMS and TRIPOD+AI.

Co-Authored-By: Claude Opus 5.5 <noreply@anthropic.com>
</commit_message>
<xml_diff>
--- a/manuscript/out/S1_protocols.docx
+++ b/manuscript/out/S1_protocols.docx
@@ -7041,6 +7041,234 @@
     <w:p>
       <w:r>
         <w:t xml:space="preserve">  ICCV, ECCV).</w:t>
+      </w:r>
+    </w:p>
+    <w:p>
+      <w:pPr>
+        <w:pStyle w:val="Heading2"/>
+      </w:pPr>
+      <w:r>
+        <w:rPr>
+          <w:rFonts w:ascii="Times New Roman" w:hAnsi="Times New Roman"/>
+        </w:rPr>
+        <w:t>Note 9-22 (2026-10-30, post hoc, after an internal review of the manuscript; frozen before the intervals below)</w:t>
+      </w:r>
+    </w:p>
+    <w:p>
+      <w:r>
+        <w:t>An internal review of the medRxiv manuscript raised three points that the existing results do not answer. Post hoc;</w:t>
+      </w:r>
+    </w:p>
+    <w:p>
+      <w:r>
+        <w:t xml:space="preserve">reported as such. Script </w:t>
+      </w:r>
+      <w:r>
+        <w:rPr>
+          <w:rFonts w:ascii="Courier New" w:hAnsi="Courier New"/>
+          <w:sz w:val="20"/>
+        </w:rPr>
+        <w:t>posthoc_p9_empirical.py</w:t>
+      </w:r>
+      <w:r>
+        <w:t xml:space="preserve">, output </w:t>
+      </w:r>
+      <w:r>
+        <w:rPr>
+          <w:rFonts w:ascii="Courier New" w:hAnsi="Courier New"/>
+          <w:sz w:val="20"/>
+        </w:rPr>
+        <w:t>results/p9_empirical.json</w:t>
+      </w:r>
+      <w:r>
+        <w:t>; MH and bootstrap exactly as</w:t>
+      </w:r>
+    </w:p>
+    <w:p>
+      <w:r>
+        <w:t>in A9.3 (</w:t>
+      </w:r>
+      <w:r>
+        <w:rPr>
+          <w:rFonts w:ascii="Courier New" w:hAnsi="Courier New"/>
+          <w:sz w:val="20"/>
+        </w:rPr>
+        <w:t>analyze_p9.mh_rd</w:t>
+      </w:r>
+      <w:r>
+        <w:t xml:space="preserve">, </w:t>
+      </w:r>
+      <w:r>
+        <w:rPr>
+          <w:rFonts w:ascii="Courier New" w:hAnsi="Courier New"/>
+          <w:sz w:val="20"/>
+        </w:rPr>
+        <w:t>boot_ci</w:t>
+      </w:r>
+      <w:r>
+        <w:t>, 2,000 resamples, seed 20261017). Disclosure: the reviewer computed the point</w:t>
+      </w:r>
+    </w:p>
+    <w:p>
+      <w:r>
+        <w:t xml:space="preserve">estimates of E-a from </w:t>
+      </w:r>
+      <w:r>
+        <w:rPr>
+          <w:rFonts w:ascii="Courier New" w:hAnsi="Courier New"/>
+          <w:sz w:val="20"/>
+        </w:rPr>
+        <w:t>results/p9_papers.csv</w:t>
+      </w:r>
+      <w:r>
+        <w:t xml:space="preserve"> before this note was written (code +10.6, main data open +7.1, weights</w:t>
+      </w:r>
+    </w:p>
+    <w:p>
+      <w:r>
+        <w:t>+21.7, variance +24.7 points); no interval and nothing in E-b or E-c had been computed.</w:t>
+      </w:r>
+    </w:p>
+    <w:p>
+      <w:pPr>
+        <w:pStyle w:val="ListBullet"/>
+      </w:pPr>
+      <w:r>
+        <w:t xml:space="preserve">E-a, empirical papers only. Units: coded frame papers whose data_scale is not </w:t>
+      </w:r>
+      <w:r>
+        <w:rPr>
+          <w:rFonts w:ascii="Courier New" w:hAnsi="Courier New"/>
+          <w:sz w:val="20"/>
+        </w:rPr>
+        <w:t>not_stated</w:t>
+      </w:r>
+      <w:r>
+        <w:t xml:space="preserve"> (a training-set size</w:t>
+      </w:r>
+    </w:p>
+    <w:p>
+      <w:r>
+        <w:t xml:space="preserve">  was stated, so the paper reports an experiment on data). Fields code, main_data_access, weights_release,</w:t>
+      </w:r>
+    </w:p>
+    <w:p>
+      <w:r>
+        <w:t xml:space="preserve">  variance, indicators as in Note 9-5, </w:t>
+      </w:r>
+      <w:r>
+        <w:rPr>
+          <w:rFonts w:ascii="Courier New" w:hAnsi="Courier New"/>
+          <w:sz w:val="20"/>
+        </w:rPr>
+        <w:t>unclear</w:t>
+      </w:r>
+      <w:r>
+        <w:t xml:space="preserve"> excluded. Reading rule: "medical papers document more" holds for a</w:t>
+      </w:r>
+    </w:p>
+    <w:p>
+      <w:r>
+        <w:t xml:space="preserve">  field among empirical papers if the CI lower bound is above 0.</w:t>
+      </w:r>
+    </w:p>
+    <w:p>
+      <w:pPr>
+        <w:pStyle w:val="ListBullet"/>
+      </w:pPr>
+      <w:r>
+        <w:t xml:space="preserve">E-b, release fields with </w:t>
+      </w:r>
+      <w:r>
+        <w:rPr>
+          <w:rFonts w:ascii="Courier New" w:hAnsi="Courier New"/>
+          <w:sz w:val="20"/>
+        </w:rPr>
+        <w:t>unclear</w:t>
+      </w:r>
+      <w:r>
+        <w:t xml:space="preserve"> counted as not released or not open: main_data_access, weights_release,</w:t>
+      </w:r>
+    </w:p>
+    <w:p>
+      <w:r>
+        <w:t xml:space="preserve">  synthetic_or_sample_release, outputs_release over all coded papers. Descriptive; shares by group and MH</w:t>
+      </w:r>
+    </w:p>
+    <w:p>
+      <w:r>
+        <w:t xml:space="preserve">  difference with CI.</w:t>
+      </w:r>
+    </w:p>
+    <w:p>
+      <w:pPr>
+        <w:pStyle w:val="ListBullet"/>
+      </w:pPr>
+      <w:r>
+        <w:t>E-c, verdict mix: attempted ICML 2026 papers as in Note 9-10 (author's namespace excluded, candidates labelled</w:t>
+      </w:r>
+    </w:p>
+    <w:p>
+      <w:r>
+        <w:t xml:space="preserve">  </w:t>
+      </w:r>
+      <w:r>
+        <w:rPr>
+          <w:rFonts w:ascii="Courier New" w:hAnsi="Courier New"/>
+          <w:sz w:val="20"/>
+        </w:rPr>
+        <w:t>no</w:t>
+      </w:r>
+      <w:r>
+        <w:t xml:space="preserve"> excluded). Claim-level shares of verified, falsified, toy, inconclusive and other by group, with the</w:t>
+      </w:r>
+    </w:p>
+    <w:p>
+      <w:r>
+        <w:t xml:space="preserve">  difference in the toy share bootstrapped over papers within group (Note 9-10 procedure); paper-level share with</w:t>
+      </w:r>
+    </w:p>
+    <w:p>
+      <w:r>
+        <w:t xml:space="preserve">  at least one toy verdict, same bootstrap. Descriptive.</w:t>
+      </w:r>
+    </w:p>
+    <w:p>
+      <w:pPr>
+        <w:pStyle w:val="ListBullet"/>
+      </w:pPr>
+      <w:r>
+        <w:t>Result (identical under PYTHONHASHSEED 0 and 1). E-a, 1,129 medical and 962 other empirical papers: code +10.6</w:t>
+      </w:r>
+    </w:p>
+    <w:p>
+      <w:r>
+        <w:t xml:space="preserve">  (CI +6.0 to +15.0), main data open +7.1 (+2.1 to +12.2), weights +21.7 (+12.7 to +30.7), variance +24.7 (+20.1 to</w:t>
+      </w:r>
+    </w:p>
+    <w:p>
+      <w:r>
+        <w:t xml:space="preserve">  +29.3); the claim holds for all four fields. E-b, unclear as no: main data open 46.2% vs 24.7% (+21.7), weights</w:t>
+      </w:r>
+    </w:p>
+    <w:p>
+      <w:r>
+        <w:t xml:space="preserve">  8.7% vs 5.6% (+3.1, +1.3 to +4.8), synthetic or sample data -0.6 (-1.7 to +0.5), outputs -0.2 (-1.2 to +0.8).</w:t>
+      </w:r>
+    </w:p>
+    <w:p>
+      <w:r>
+        <w:t xml:space="preserve">  E-c, claim verdicts of medical vs other attempted papers: verified 21.7% vs 49.7%, falsified 3.6% vs 4.7%, toy</w:t>
+      </w:r>
+    </w:p>
+    <w:p>
+      <w:r>
+        <w:t xml:space="preserve">  25.5% vs 20.9% (difference +4.7, -0.6 to +10.7), inconclusive 49.2% vs 24.8%; papers with any toy verdict 64.5% vs</w:t>
+      </w:r>
+    </w:p>
+    <w:p>
+      <w:r>
+        <w:t xml:space="preserve">  71.3% (-6.8, -15.9 to +2.3).</w:t>
       </w:r>
     </w:p>
     <w:p>
@@ -7097,7 +7325,7 @@
                 <w:b/>
                 <w:sz w:val="18"/>
               </w:rPr>
-              <w:t>Life science: frame / full text</w:t>
+              <w:t>Medical: frame / full text</w:t>
             </w:r>
           </w:p>
         </w:tc>

</xml_diff>